<commit_message>
Pregunta antes de salir de un formulario con cambios sin guardar
La ventana «Salir sin guardar» ofrece Sí (sale a la opción elegida) y No (se queda en el
formulario) en clientes, empresas, locales y contratos. Corrige la prueba de morosidad que
dependía del día del mes y actualiza el manual, la guía de pruebas y la especificación.

Co-Authored-By: Claude Sonnet 5.5 <noreply@anthropic.com>
</commit_message>
<xml_diff>
--- a/Presentacion/Especificacion_y_Trazabilidad_SDD.docx
+++ b/Presentacion/Especificacion_y_Trazabilidad_SDD.docx
@@ -2895,7 +2895,7 @@
                 <w:sz w:val="17"/>
                 <w:szCs w:val="17"/>
               </w:rPr>
-              <w:t xml:space="preserve">Listar con búsqueda y paginación, obtener, crear, actualizar y desactivar. Crear y editar: cualquier usuario; desactivar: administrador.</w:t>
+              <w:t>Listar con búsqueda y paginación, obtener, crear, actualizar y desactivar. Crear y editar: cualquier usuario; desactivar: administrador. El código (CLI-NNNN, EMP-NNNN, LOC-NNNN) lo asigna el sistema al guardar y no se puede editar.</w:t>
             </w:r>
           </w:p>
         </w:tc>
@@ -3029,7 +3029,7 @@
                 <w:sz w:val="17"/>
                 <w:szCs w:val="17"/>
               </w:rPr>
-              <w:t xml:space="preserve">Listar, obtener, crear, actualizar y desactivar empresas (RUC válido y único). Escritura solo del administrador.</w:t>
+              <w:t>Listar, obtener, crear, actualizar y desactivar empresas (RUC válido y único). Escritura solo del administrador. El código (CLI-NNNN, EMP-NNNN, LOC-NNNN) lo asigna el sistema al guardar y no se puede editar.</w:t>
             </w:r>
           </w:p>
         </w:tc>
@@ -3165,7 +3165,7 @@
                 <w:sz w:val="17"/>
                 <w:szCs w:val="17"/>
               </w:rPr>
-              <w:t xml:space="preserve">Listar con filtros (empresa, tipo, estado), obtener, crear, actualizar y desactivar locales. Escritura solo del administrador.</w:t>
+              <w:t>Listar con filtros (empresa, tipo, estado), obtener, crear, actualizar y desactivar locales. Escritura solo del administrador. El código (CLI-NNNN, EMP-NNNN, LOC-NNNN) lo asigna el sistema al guardar y no se puede editar.</w:t>
             </w:r>
           </w:p>
         </w:tc>
@@ -5325,7 +5325,7 @@
                 <w:sz w:val="17"/>
                 <w:szCs w:val="17"/>
               </w:rPr>
-              <w:t xml:space="preserve">Interfaz Angular que cubre el flujo completo: login, panel con gráficos, maestros, contratos, pagos y deudas, con rutas protegidas por rol.</w:t>
+              <w:t>Interfaz Angular que cubre el flujo completo: login, panel con gráficos, maestros, contratos, pagos y deudas, con rutas protegidas por rol. Los formularios preguntan con una ventana Sí/No si se intenta salir con cambios sin guardar.</w:t>
             </w:r>
           </w:p>
         </w:tc>
@@ -5570,7 +5570,7 @@
                 <w:sz w:val="17"/>
                 <w:szCs w:val="17"/>
               </w:rPr>
-              <w:t xml:space="preserve">Los códigos de cliente, empresa y local son únicos, incluso frente a registros dados de baja.</w:t>
+              <w:t>El sistema genera los códigos de cliente, empresa y local (CLI-NNNN, EMP-NNNN, LOC-NNNN) al guardar; no se escriben ni se editan, y son únicos, incluso frente a registros dados de baja.</w:t>
             </w:r>
           </w:p>
         </w:tc>
@@ -9033,7 +9033,7 @@
                 <w:sz w:val="17"/>
                 <w:szCs w:val="17"/>
               </w:rPr>
-              <w:t xml:space="preserve">ClientesApiTests (18)</w:t>
+              <w:t>ClientesApiTests (20)</w:t>
             </w:r>
           </w:p>
           <w:p>
@@ -9228,7 +9228,7 @@
                 <w:sz w:val="17"/>
                 <w:szCs w:val="17"/>
               </w:rPr>
-              <w:t xml:space="preserve">EmpresasApiTests (10)</w:t>
+              <w:t>EmpresasApiTests (13)</w:t>
             </w:r>
           </w:p>
         </w:tc>
@@ -9413,7 +9413,7 @@
                 <w:sz w:val="17"/>
                 <w:szCs w:val="17"/>
               </w:rPr>
-              <w:t xml:space="preserve">LocalesApiTests (15)</w:t>
+              <w:t>LocalesApiTests (17)</w:t>
             </w:r>
           </w:p>
         </w:tc>
@@ -12408,7 +12408,7 @@
                 <w:sz w:val="17"/>
                 <w:szCs w:val="17"/>
               </w:rPr>
-              <w:t xml:space="preserve">componentes.spec, formato.spec, fechas.spec, api.utils.spec, servicios-ui.spec</w:t>
+              <w:t>componentes.spec, formato.spec, fechas.spec, api.utils.spec, servicios-ui.spec, salir-sin-guardar.spec, codigo-automatico.spec</w:t>
             </w:r>
           </w:p>
           <w:p>
@@ -12667,7 +12667,7 @@
                 <w:sz w:val="17"/>
                 <w:szCs w:val="17"/>
               </w:rPr>
-              <w:t xml:space="preserve">Crear_CodigoDuplicado_Devuelve400 (Clientes, Locales); Crear_ConCodigoDeClienteDadoDeBaja_Devuelve400EnVezDeError500</w:t>
+              <w:t>Crear_AsignaCodigoAutomaticoConFormato, Crear_DosClientes/Empresas/Locales_RecibenCodigosDistintosYCrecientes y Crear_IgnoraElCodigoEnviadoPorElCliente (Clientes, Empresas y Locales); GeneradorCodigoTests (salta los códigos ya usados)</w:t>
             </w:r>
           </w:p>
         </w:tc>
@@ -15470,7 +15470,7 @@
                 <w:sz w:val="17"/>
                 <w:szCs w:val="17"/>
               </w:rPr>
-              <w:t xml:space="preserve">176 métodos de prueba (unitarias e integración), sin contar los casos de las pruebas parametrizadas</w:t>
+              <w:t>186 métodos de prueba (unitarias e integración), sin contar los casos de las pruebas parametrizadas</w:t>
             </w:r>
           </w:p>
         </w:tc>
@@ -15539,7 +15539,7 @@
                 <w:sz w:val="17"/>
                 <w:szCs w:val="17"/>
               </w:rPr>
-              <w:t xml:space="preserve">154 pruebas en 14 archivos spec</w:t>
+              <w:t>181 pruebas en 16 archivos spec</w:t>
             </w:r>
           </w:p>
         </w:tc>

</xml_diff>